<commit_message>
fazendo a página Redações e Historia
</commit_message>
<xml_diff>
--- a/link usáveis/LINK DOS SITES PARA VESTIBULARES.docx
+++ b/link usáveis/LINK DOS SITES PARA VESTIBULARES.docx
@@ -17,7 +17,7 @@
           <w:b/>
           <w:sz w:val="32"/>
         </w:rPr>
-        <w:t>LINK DOS SITES PARA VESTIBULARES</w:t>
+        <w:t xml:space="preserve">LINK </w:t>
       </w:r>
     </w:p>
     <w:p>
@@ -399,38 +399,45 @@
     </w:p>
     <w:p>
       <w:pPr>
-        <w:jc w:val="center"/>
-        <w:rPr>
-          <w:rFonts w:ascii="Times New Roman" w:hAnsi="Times New Roman" w:cs="Times New Roman"/>
-          <w:b/>
-        </w:rPr>
-      </w:pPr>
-    </w:p>
-    <w:p>
-      <w:pPr>
-        <w:jc w:val="center"/>
-        <w:rPr>
-          <w:rFonts w:ascii="Times New Roman" w:hAnsi="Times New Roman" w:cs="Times New Roman"/>
-          <w:b/>
-        </w:rPr>
-      </w:pPr>
-      <w:r>
-        <w:rPr>
-          <w:rFonts w:ascii="Times New Roman" w:hAnsi="Times New Roman" w:cs="Times New Roman"/>
-          <w:b/>
-        </w:rPr>
-        <w:lastRenderedPageBreak/>
-        <w:t>EXERCICIOS</w:t>
-      </w:r>
-    </w:p>
-    <w:p>
-      <w:pPr>
-        <w:jc w:val="center"/>
-        <w:rPr>
-          <w:rFonts w:ascii="Times New Roman" w:hAnsi="Times New Roman" w:cs="Times New Roman"/>
-          <w:b/>
-        </w:rPr>
-      </w:pPr>
+        <w:rPr>
+          <w:rFonts w:ascii="Times New Roman" w:hAnsi="Times New Roman" w:cs="Times New Roman"/>
+          <w:b/>
+        </w:rPr>
+      </w:pPr>
+    </w:p>
+    <w:p>
+      <w:pPr>
+        <w:jc w:val="center"/>
+        <w:rPr>
+          <w:rFonts w:ascii="Times New Roman" w:hAnsi="Times New Roman" w:cs="Times New Roman"/>
+          <w:b/>
+        </w:rPr>
+      </w:pPr>
+    </w:p>
+    <w:p>
+      <w:pPr>
+        <w:jc w:val="center"/>
+        <w:rPr>
+          <w:rFonts w:ascii="Times New Roman" w:hAnsi="Times New Roman" w:cs="Times New Roman"/>
+          <w:b/>
+        </w:rPr>
+      </w:pPr>
+    </w:p>
+    <w:p>
+      <w:pPr>
+        <w:jc w:val="center"/>
+        <w:rPr>
+          <w:rFonts w:ascii="Times New Roman" w:hAnsi="Times New Roman" w:cs="Times New Roman"/>
+          <w:b/>
+        </w:rPr>
+      </w:pPr>
+      <w:r>
+        <w:rPr>
+          <w:rFonts w:ascii="Times New Roman" w:hAnsi="Times New Roman" w:cs="Times New Roman"/>
+          <w:b/>
+        </w:rPr>
+        <w:t>REDAÇÕES</w:t>
+      </w:r>
     </w:p>
     <w:p>
       <w:pPr>
@@ -447,9 +454,81 @@
             <w:rFonts w:ascii="Times New Roman" w:hAnsi="Times New Roman" w:cs="Times New Roman"/>
             <w:b/>
           </w:rPr>
-          <w:t>https://dex.descomplica.com.br/</w:t>
+          <w:t>https://redacao.descomplica.com.br/temas-de-redacao</w:t>
         </w:r>
       </w:hyperlink>
+    </w:p>
+    <w:p>
+      <w:pPr>
+        <w:jc w:val="center"/>
+        <w:rPr>
+          <w:rFonts w:ascii="Times New Roman" w:hAnsi="Times New Roman" w:cs="Times New Roman"/>
+          <w:b/>
+        </w:rPr>
+      </w:pPr>
+      <w:hyperlink r:id="rId11" w:history="1">
+        <w:r>
+          <w:rPr>
+            <w:rStyle w:val="Hyperlink"/>
+            <w:rFonts w:ascii="Times New Roman" w:hAnsi="Times New Roman" w:cs="Times New Roman"/>
+            <w:b/>
+          </w:rPr>
+          <w:t>https://www.plataformaredigir.com.br/temas-redacao</w:t>
+        </w:r>
+      </w:hyperlink>
+    </w:p>
+    <w:p>
+      <w:pPr>
+        <w:jc w:val="center"/>
+        <w:rPr>
+          <w:rFonts w:ascii="Times New Roman" w:hAnsi="Times New Roman" w:cs="Times New Roman"/>
+          <w:b/>
+        </w:rPr>
+      </w:pPr>
+    </w:p>
+    <w:p>
+      <w:pPr>
+        <w:jc w:val="center"/>
+        <w:rPr>
+          <w:rFonts w:ascii="Times New Roman" w:hAnsi="Times New Roman" w:cs="Times New Roman"/>
+          <w:b/>
+        </w:rPr>
+      </w:pPr>
+      <w:r>
+        <w:rPr>
+          <w:rFonts w:ascii="Times New Roman" w:hAnsi="Times New Roman" w:cs="Times New Roman"/>
+          <w:b/>
+        </w:rPr>
+        <w:t>Professor</w:t>
+      </w:r>
+    </w:p>
+    <w:p>
+      <w:pPr>
+        <w:jc w:val="center"/>
+        <w:rPr>
+          <w:rFonts w:ascii="Times New Roman" w:hAnsi="Times New Roman" w:cs="Times New Roman"/>
+          <w:b/>
+        </w:rPr>
+      </w:pPr>
+      <w:hyperlink r:id="rId12" w:history="1">
+        <w:r>
+          <w:rPr>
+            <w:rStyle w:val="Hyperlink"/>
+            <w:rFonts w:ascii="Times New Roman" w:hAnsi="Times New Roman" w:cs="Times New Roman"/>
+            <w:b/>
+          </w:rPr>
+          <w:t>https://www.youtube.com/@ProfessoraPamba/videos</w:t>
+        </w:r>
+      </w:hyperlink>
+    </w:p>
+    <w:p>
+      <w:pPr>
+        <w:jc w:val="center"/>
+        <w:rPr>
+          <w:rFonts w:ascii="Times New Roman" w:hAnsi="Times New Roman" w:cs="Times New Roman"/>
+          <w:b/>
+        </w:rPr>
+      </w:pPr>
     </w:p>
     <w:p>
       <w:pPr>
@@ -485,8 +564,432 @@
           <w:rFonts w:ascii="Times New Roman" w:hAnsi="Times New Roman" w:cs="Times New Roman"/>
           <w:b/>
         </w:rPr>
-        <w:t>REDAÇÕES</w:t>
-      </w:r>
+        <w:t>VIDEOAULAS</w:t>
+      </w:r>
+    </w:p>
+    <w:p>
+      <w:pPr>
+        <w:jc w:val="center"/>
+        <w:rPr>
+          <w:rFonts w:ascii="Times New Roman" w:hAnsi="Times New Roman" w:cs="Times New Roman"/>
+          <w:b/>
+        </w:rPr>
+      </w:pPr>
+      <w:r>
+        <w:rPr>
+          <w:rFonts w:ascii="Times New Roman" w:hAnsi="Times New Roman" w:cs="Times New Roman"/>
+          <w:b/>
+        </w:rPr>
+        <w:t>CANAIS</w:t>
+      </w:r>
+    </w:p>
+    <w:p>
+      <w:pPr>
+        <w:jc w:val="center"/>
+        <w:rPr>
+          <w:rFonts w:ascii="Times New Roman" w:hAnsi="Times New Roman" w:cs="Times New Roman"/>
+          <w:b/>
+        </w:rPr>
+      </w:pPr>
+    </w:p>
+    <w:p>
+      <w:pPr>
+        <w:jc w:val="center"/>
+        <w:rPr>
+          <w:rFonts w:ascii="Times New Roman" w:hAnsi="Times New Roman" w:cs="Times New Roman"/>
+          <w:b/>
+        </w:rPr>
+      </w:pPr>
+      <w:r>
+        <w:rPr>
+          <w:rFonts w:ascii="Times New Roman" w:hAnsi="Times New Roman" w:cs="Times New Roman"/>
+          <w:b/>
+        </w:rPr>
+        <w:t>Português</w:t>
+      </w:r>
+    </w:p>
+    <w:p>
+      <w:pPr>
+        <w:jc w:val="center"/>
+        <w:rPr>
+          <w:rFonts w:ascii="Times New Roman" w:hAnsi="Times New Roman" w:cs="Times New Roman"/>
+          <w:b/>
+        </w:rPr>
+      </w:pPr>
+      <w:hyperlink r:id="rId13" w:history="1">
+        <w:r>
+          <w:rPr>
+            <w:rStyle w:val="Hyperlink"/>
+            <w:rFonts w:ascii="Times New Roman" w:hAnsi="Times New Roman" w:cs="Times New Roman"/>
+            <w:b/>
+          </w:rPr>
+          <w:t>https://www.youtube.com/@ProfessorNoslen</w:t>
+        </w:r>
+      </w:hyperlink>
+    </w:p>
+    <w:p>
+      <w:pPr>
+        <w:jc w:val="center"/>
+        <w:rPr>
+          <w:rFonts w:ascii="Times New Roman" w:hAnsi="Times New Roman" w:cs="Times New Roman"/>
+          <w:b/>
+        </w:rPr>
+      </w:pPr>
+    </w:p>
+    <w:p>
+      <w:pPr>
+        <w:jc w:val="center"/>
+        <w:rPr>
+          <w:rFonts w:ascii="Times New Roman" w:hAnsi="Times New Roman" w:cs="Times New Roman"/>
+          <w:b/>
+        </w:rPr>
+      </w:pPr>
+      <w:r>
+        <w:rPr>
+          <w:rFonts w:ascii="Times New Roman" w:hAnsi="Times New Roman" w:cs="Times New Roman"/>
+          <w:b/>
+        </w:rPr>
+        <w:t>Matemática</w:t>
+      </w:r>
+    </w:p>
+    <w:p>
+      <w:pPr>
+        <w:jc w:val="center"/>
+        <w:rPr>
+          <w:rFonts w:ascii="Times New Roman" w:hAnsi="Times New Roman" w:cs="Times New Roman"/>
+          <w:b/>
+        </w:rPr>
+      </w:pPr>
+      <w:hyperlink r:id="rId14" w:history="1">
+        <w:r>
+          <w:rPr>
+            <w:rStyle w:val="Hyperlink"/>
+            <w:rFonts w:ascii="Times New Roman" w:hAnsi="Times New Roman" w:cs="Times New Roman"/>
+            <w:b/>
+          </w:rPr>
+          <w:t>https://www.youtube.com/@professorferretto/videos</w:t>
+        </w:r>
+      </w:hyperlink>
+    </w:p>
+    <w:p>
+      <w:pPr>
+        <w:jc w:val="center"/>
+        <w:rPr>
+          <w:rFonts w:ascii="Times New Roman" w:hAnsi="Times New Roman" w:cs="Times New Roman"/>
+          <w:b/>
+        </w:rPr>
+      </w:pPr>
+    </w:p>
+    <w:p>
+      <w:pPr>
+        <w:jc w:val="center"/>
+        <w:rPr>
+          <w:rFonts w:ascii="Times New Roman" w:hAnsi="Times New Roman" w:cs="Times New Roman"/>
+          <w:b/>
+        </w:rPr>
+      </w:pPr>
+      <w:r>
+        <w:rPr>
+          <w:rFonts w:ascii="Times New Roman" w:hAnsi="Times New Roman" w:cs="Times New Roman"/>
+          <w:b/>
+        </w:rPr>
+        <w:t>História</w:t>
+      </w:r>
+    </w:p>
+    <w:p>
+      <w:pPr>
+        <w:jc w:val="center"/>
+        <w:rPr>
+          <w:rFonts w:ascii="Times New Roman" w:hAnsi="Times New Roman" w:cs="Times New Roman"/>
+          <w:b/>
+        </w:rPr>
+      </w:pPr>
+      <w:hyperlink r:id="rId15" w:history="1">
+        <w:r>
+          <w:rPr>
+            <w:rStyle w:val="Hyperlink"/>
+            <w:rFonts w:ascii="Times New Roman" w:hAnsi="Times New Roman" w:cs="Times New Roman"/>
+            <w:b/>
+          </w:rPr>
+          <w:t>https://www.youtube.com/@deboraaladim</w:t>
+        </w:r>
+      </w:hyperlink>
+    </w:p>
+    <w:p>
+      <w:pPr>
+        <w:jc w:val="center"/>
+        <w:rPr>
+          <w:rFonts w:ascii="Times New Roman" w:hAnsi="Times New Roman" w:cs="Times New Roman"/>
+          <w:b/>
+        </w:rPr>
+      </w:pPr>
+    </w:p>
+    <w:p>
+      <w:pPr>
+        <w:jc w:val="center"/>
+        <w:rPr>
+          <w:rFonts w:ascii="Times New Roman" w:hAnsi="Times New Roman" w:cs="Times New Roman"/>
+          <w:b/>
+        </w:rPr>
+      </w:pPr>
+      <w:r>
+        <w:rPr>
+          <w:rFonts w:ascii="Times New Roman" w:hAnsi="Times New Roman" w:cs="Times New Roman"/>
+          <w:b/>
+        </w:rPr>
+        <w:t>Geografia</w:t>
+      </w:r>
+    </w:p>
+    <w:p>
+      <w:pPr>
+        <w:jc w:val="center"/>
+        <w:rPr>
+          <w:rFonts w:ascii="Times New Roman" w:hAnsi="Times New Roman" w:cs="Times New Roman"/>
+          <w:b/>
+        </w:rPr>
+      </w:pPr>
+      <w:hyperlink r:id="rId16" w:history="1">
+        <w:r>
+          <w:rPr>
+            <w:rStyle w:val="Hyperlink"/>
+            <w:rFonts w:ascii="Times New Roman" w:hAnsi="Times New Roman" w:cs="Times New Roman"/>
+            <w:b/>
+          </w:rPr>
+          <w:t>https://www.youtube.com/@ProfVaretaGeoRaiz/</w:t>
+        </w:r>
+      </w:hyperlink>
+    </w:p>
+    <w:p>
+      <w:pPr>
+        <w:rPr>
+          <w:rFonts w:ascii="Times New Roman" w:hAnsi="Times New Roman" w:cs="Times New Roman"/>
+          <w:b/>
+        </w:rPr>
+      </w:pPr>
+    </w:p>
+    <w:p>
+      <w:pPr>
+        <w:jc w:val="center"/>
+        <w:rPr>
+          <w:rFonts w:ascii="Times New Roman" w:hAnsi="Times New Roman" w:cs="Times New Roman"/>
+          <w:b/>
+        </w:rPr>
+      </w:pPr>
+      <w:r>
+        <w:rPr>
+          <w:rFonts w:ascii="Times New Roman" w:hAnsi="Times New Roman" w:cs="Times New Roman"/>
+          <w:b/>
+        </w:rPr>
+        <w:t>Biologia</w:t>
+      </w:r>
+    </w:p>
+    <w:p>
+      <w:pPr>
+        <w:jc w:val="center"/>
+        <w:rPr>
+          <w:rFonts w:ascii="Times New Roman" w:hAnsi="Times New Roman" w:cs="Times New Roman"/>
+          <w:b/>
+        </w:rPr>
+      </w:pPr>
+      <w:hyperlink r:id="rId17" w:history="1">
+        <w:r>
+          <w:rPr>
+            <w:rStyle w:val="Hyperlink"/>
+            <w:rFonts w:ascii="Times New Roman" w:hAnsi="Times New Roman" w:cs="Times New Roman"/>
+            <w:b/>
+          </w:rPr>
+          <w:t>https://www.youtube.com/@paulojubilut</w:t>
+        </w:r>
+      </w:hyperlink>
+    </w:p>
+    <w:p>
+      <w:pPr>
+        <w:jc w:val="center"/>
+        <w:rPr>
+          <w:rFonts w:ascii="Times New Roman" w:hAnsi="Times New Roman" w:cs="Times New Roman"/>
+          <w:b/>
+        </w:rPr>
+      </w:pPr>
+    </w:p>
+    <w:p>
+      <w:pPr>
+        <w:jc w:val="center"/>
+        <w:rPr>
+          <w:rFonts w:ascii="Times New Roman" w:hAnsi="Times New Roman" w:cs="Times New Roman"/>
+          <w:b/>
+        </w:rPr>
+      </w:pPr>
+      <w:r>
+        <w:rPr>
+          <w:rFonts w:ascii="Times New Roman" w:hAnsi="Times New Roman" w:cs="Times New Roman"/>
+          <w:b/>
+        </w:rPr>
+        <w:t>Física</w:t>
+      </w:r>
+    </w:p>
+    <w:p>
+      <w:pPr>
+        <w:jc w:val="center"/>
+        <w:rPr>
+          <w:rFonts w:ascii="Times New Roman" w:hAnsi="Times New Roman" w:cs="Times New Roman"/>
+          <w:b/>
+        </w:rPr>
+      </w:pPr>
+      <w:hyperlink r:id="rId18" w:history="1">
+        <w:r>
+          <w:rPr>
+            <w:rStyle w:val="Hyperlink"/>
+            <w:rFonts w:ascii="Times New Roman" w:hAnsi="Times New Roman" w:cs="Times New Roman"/>
+            <w:b/>
+          </w:rPr>
+          <w:t>https://www.youtube.com/@professorboaro</w:t>
+        </w:r>
+      </w:hyperlink>
+    </w:p>
+    <w:p>
+      <w:pPr>
+        <w:jc w:val="center"/>
+        <w:rPr>
+          <w:rFonts w:ascii="Times New Roman" w:hAnsi="Times New Roman" w:cs="Times New Roman"/>
+          <w:b/>
+        </w:rPr>
+      </w:pPr>
+    </w:p>
+    <w:p>
+      <w:pPr>
+        <w:jc w:val="center"/>
+        <w:rPr>
+          <w:rFonts w:ascii="Times New Roman" w:hAnsi="Times New Roman" w:cs="Times New Roman"/>
+          <w:b/>
+        </w:rPr>
+      </w:pPr>
+      <w:r>
+        <w:rPr>
+          <w:rFonts w:ascii="Times New Roman" w:hAnsi="Times New Roman" w:cs="Times New Roman"/>
+          <w:b/>
+        </w:rPr>
+        <w:lastRenderedPageBreak/>
+        <w:t>Química</w:t>
+      </w:r>
+    </w:p>
+    <w:p>
+      <w:pPr>
+        <w:jc w:val="center"/>
+        <w:rPr>
+          <w:rFonts w:ascii="Times New Roman" w:hAnsi="Times New Roman" w:cs="Times New Roman"/>
+          <w:b/>
+        </w:rPr>
+      </w:pPr>
+      <w:hyperlink r:id="rId19" w:history="1">
+        <w:r>
+          <w:rPr>
+            <w:rStyle w:val="Hyperlink"/>
+            <w:rFonts w:ascii="Times New Roman" w:hAnsi="Times New Roman" w:cs="Times New Roman"/>
+            <w:b/>
+          </w:rPr>
+          <w:t>https://www.youtube.com/@paulovalim/videos</w:t>
+        </w:r>
+      </w:hyperlink>
+    </w:p>
+    <w:p>
+      <w:pPr>
+        <w:jc w:val="center"/>
+        <w:rPr>
+          <w:rFonts w:ascii="Times New Roman" w:hAnsi="Times New Roman" w:cs="Times New Roman"/>
+          <w:b/>
+        </w:rPr>
+      </w:pPr>
+    </w:p>
+    <w:p>
+      <w:pPr>
+        <w:jc w:val="center"/>
+        <w:rPr>
+          <w:rFonts w:ascii="Times New Roman" w:hAnsi="Times New Roman" w:cs="Times New Roman"/>
+          <w:b/>
+        </w:rPr>
+      </w:pPr>
+      <w:r>
+        <w:rPr>
+          <w:rFonts w:ascii="Times New Roman" w:hAnsi="Times New Roman" w:cs="Times New Roman"/>
+          <w:b/>
+        </w:rPr>
+        <w:t>Filosofia e Sociologia</w:t>
+      </w:r>
+    </w:p>
+    <w:p>
+      <w:pPr>
+        <w:jc w:val="center"/>
+        <w:rPr>
+          <w:rFonts w:ascii="Times New Roman" w:hAnsi="Times New Roman" w:cs="Times New Roman"/>
+          <w:b/>
+        </w:rPr>
+      </w:pPr>
+      <w:hyperlink r:id="rId20" w:history="1">
+        <w:r>
+          <w:rPr>
+            <w:rStyle w:val="Hyperlink"/>
+            <w:rFonts w:ascii="Times New Roman" w:hAnsi="Times New Roman" w:cs="Times New Roman"/>
+            <w:b/>
+          </w:rPr>
+          <w:t>https://www.youtube.com/@filosofiatotal/videos</w:t>
+        </w:r>
+      </w:hyperlink>
+    </w:p>
+    <w:p>
+      <w:pPr>
+        <w:jc w:val="center"/>
+        <w:rPr>
+          <w:rFonts w:ascii="Times New Roman" w:hAnsi="Times New Roman" w:cs="Times New Roman"/>
+          <w:b/>
+        </w:rPr>
+      </w:pPr>
+    </w:p>
+    <w:p>
+      <w:pPr>
+        <w:jc w:val="center"/>
+        <w:rPr>
+          <w:rFonts w:ascii="Times New Roman" w:hAnsi="Times New Roman" w:cs="Times New Roman"/>
+          <w:b/>
+        </w:rPr>
+      </w:pPr>
+      <w:r>
+        <w:rPr>
+          <w:rFonts w:ascii="Times New Roman" w:hAnsi="Times New Roman" w:cs="Times New Roman"/>
+          <w:b/>
+        </w:rPr>
+        <w:t>Inglês</w:t>
+      </w:r>
+    </w:p>
+    <w:p>
+      <w:pPr>
+        <w:jc w:val="center"/>
+        <w:rPr>
+          <w:rFonts w:ascii="Times New Roman" w:hAnsi="Times New Roman" w:cs="Times New Roman"/>
+          <w:b/>
+        </w:rPr>
+      </w:pPr>
+      <w:hyperlink r:id="rId21" w:history="1">
+        <w:r>
+          <w:rPr>
+            <w:rStyle w:val="Hyperlink"/>
+            <w:rFonts w:ascii="Times New Roman" w:hAnsi="Times New Roman" w:cs="Times New Roman"/>
+            <w:b/>
+          </w:rPr>
+          <w:t>https://www.youtube.com/@mairovergara</w:t>
+        </w:r>
+      </w:hyperlink>
+    </w:p>
+    <w:p>
+      <w:pPr>
+        <w:pBdr>
+          <w:bottom w:val="single" w:sz="6" w:space="1" w:color="auto"/>
+        </w:pBdr>
+        <w:jc w:val="center"/>
+        <w:rPr>
+          <w:rFonts w:ascii="Times New Roman" w:hAnsi="Times New Roman" w:cs="Times New Roman"/>
+          <w:b/>
+        </w:rPr>
+      </w:pPr>
     </w:p>
     <w:p>
       <w:pPr>
@@ -498,6 +1001,122 @@
       </w:pPr>
       <w:bookmarkStart w:id="0" w:name="_GoBack"/>
       <w:bookmarkEnd w:id="0"/>
+    </w:p>
+    <w:p>
+      <w:pPr>
+        <w:jc w:val="center"/>
+        <w:rPr>
+          <w:rFonts w:ascii="Times New Roman" w:hAnsi="Times New Roman" w:cs="Times New Roman"/>
+          <w:b/>
+        </w:rPr>
+      </w:pPr>
+    </w:p>
+    <w:p>
+      <w:pPr>
+        <w:jc w:val="center"/>
+        <w:rPr>
+          <w:rFonts w:ascii="Times New Roman" w:hAnsi="Times New Roman" w:cs="Times New Roman"/>
+          <w:b/>
+        </w:rPr>
+      </w:pPr>
+      <w:r>
+        <w:rPr>
+          <w:rFonts w:ascii="Times New Roman" w:hAnsi="Times New Roman" w:cs="Times New Roman"/>
+          <w:b/>
+        </w:rPr>
+        <w:t>EXERCICIOS DE CADA MATÉRIA</w:t>
+      </w:r>
+    </w:p>
+    <w:p>
+      <w:pPr>
+        <w:jc w:val="center"/>
+        <w:rPr>
+          <w:rFonts w:ascii="Times New Roman" w:hAnsi="Times New Roman" w:cs="Times New Roman"/>
+          <w:b/>
+        </w:rPr>
+      </w:pPr>
+      <w:hyperlink r:id="rId22" w:history="1">
+        <w:r>
+          <w:rPr>
+            <w:rStyle w:val="Hyperlink"/>
+            <w:rFonts w:ascii="Times New Roman" w:hAnsi="Times New Roman" w:cs="Times New Roman"/>
+            <w:b/>
+          </w:rPr>
+          <w:t>https://www.todamateria.com.br/exercicios/exercicios-de-portugues/</w:t>
+        </w:r>
+      </w:hyperlink>
+    </w:p>
+    <w:p>
+      <w:pPr>
+        <w:jc w:val="center"/>
+        <w:rPr>
+          <w:rFonts w:ascii="Times New Roman" w:hAnsi="Times New Roman" w:cs="Times New Roman"/>
+          <w:b/>
+        </w:rPr>
+      </w:pPr>
+    </w:p>
+    <w:p>
+      <w:pPr>
+        <w:jc w:val="center"/>
+        <w:rPr>
+          <w:rFonts w:ascii="Times New Roman" w:hAnsi="Times New Roman" w:cs="Times New Roman"/>
+          <w:b/>
+        </w:rPr>
+      </w:pPr>
+    </w:p>
+    <w:p>
+      <w:pPr>
+        <w:jc w:val="center"/>
+        <w:rPr>
+          <w:rFonts w:ascii="Times New Roman" w:hAnsi="Times New Roman" w:cs="Times New Roman"/>
+          <w:b/>
+        </w:rPr>
+      </w:pPr>
+    </w:p>
+    <w:p>
+      <w:pPr>
+        <w:jc w:val="center"/>
+        <w:rPr>
+          <w:rFonts w:ascii="Times New Roman" w:hAnsi="Times New Roman" w:cs="Times New Roman"/>
+          <w:b/>
+        </w:rPr>
+      </w:pPr>
+    </w:p>
+    <w:p>
+      <w:pPr>
+        <w:jc w:val="center"/>
+        <w:rPr>
+          <w:rFonts w:ascii="Times New Roman" w:hAnsi="Times New Roman" w:cs="Times New Roman"/>
+          <w:b/>
+        </w:rPr>
+      </w:pPr>
+    </w:p>
+    <w:p>
+      <w:pPr>
+        <w:jc w:val="center"/>
+        <w:rPr>
+          <w:rFonts w:ascii="Times New Roman" w:hAnsi="Times New Roman" w:cs="Times New Roman"/>
+          <w:b/>
+        </w:rPr>
+      </w:pPr>
+    </w:p>
+    <w:p>
+      <w:pPr>
+        <w:jc w:val="center"/>
+        <w:rPr>
+          <w:rFonts w:ascii="Times New Roman" w:hAnsi="Times New Roman" w:cs="Times New Roman"/>
+          <w:b/>
+        </w:rPr>
+      </w:pPr>
+    </w:p>
+    <w:p>
+      <w:pPr>
+        <w:jc w:val="center"/>
+        <w:rPr>
+          <w:rFonts w:ascii="Times New Roman" w:hAnsi="Times New Roman" w:cs="Times New Roman"/>
+          <w:b/>
+        </w:rPr>
+      </w:pPr>
     </w:p>
     <w:sectPr>
       <w:pgSz w:w="11906" w:h="16838"/>

</xml_diff>